<commit_message>
fix: Update author name and adjust test case metrics in project report
</commit_message>
<xml_diff>
--- a/FINAL PROJECT REPORT.docx
+++ b/FINAL PROJECT REPORT.docx
@@ -197,78 +197,1394 @@
           <w:sz w:val="28"/>
           <w:szCs w:val="28"/>
         </w:rPr>
-        <w:t>Author:             QA Automation Team</w:t>
-      </w:r>
-    </w:p>
-    <w:p>
-      <w:pPr>
-        <w:jc w:val="center"/>
+        <w:t xml:space="preserve">Author:             </w:t>
+      </w:r>
+      <w:r>
         <w:rPr>
           <w:b/>
           <w:bCs/>
           <w:sz w:val="28"/>
           <w:szCs w:val="28"/>
         </w:rPr>
-      </w:pPr>
-      <w:r>
+        <w:t>Bismark Kadogbe</w:t>
+      </w:r>
+    </w:p>
+    <w:p>
+      <w:pPr>
+        <w:jc w:val="center"/>
         <w:rPr>
           <w:b/>
           <w:bCs/>
           <w:sz w:val="28"/>
           <w:szCs w:val="28"/>
         </w:rPr>
-        <w:t>Date Completed:     May 07, 2026</w:t>
-      </w:r>
-    </w:p>
-    <w:p>
-      <w:pPr>
-        <w:jc w:val="center"/>
+      </w:pPr>
+      <w:r>
         <w:rPr>
           <w:b/>
           <w:bCs/>
           <w:sz w:val="28"/>
           <w:szCs w:val="28"/>
         </w:rPr>
-      </w:pPr>
-      <w:r>
+        <w:t>Date Completed:     May 07, 2026</w:t>
+      </w:r>
+    </w:p>
+    <w:p>
+      <w:pPr>
+        <w:jc w:val="center"/>
         <w:rPr>
           <w:b/>
           <w:bCs/>
           <w:sz w:val="28"/>
           <w:szCs w:val="28"/>
         </w:rPr>
-        <w:t>Project Duration:   6 Weeks</w:t>
-      </w:r>
-    </w:p>
-    <w:p>
-      <w:pPr>
-        <w:jc w:val="center"/>
+      </w:pPr>
+      <w:r>
         <w:rPr>
           <w:b/>
           <w:bCs/>
           <w:sz w:val="28"/>
           <w:szCs w:val="28"/>
         </w:rPr>
-      </w:pPr>
-      <w:r>
+        <w:t>Project Duration:   6 Weeks</w:t>
+      </w:r>
+    </w:p>
+    <w:p>
+      <w:pPr>
+        <w:jc w:val="center"/>
         <w:rPr>
           <w:b/>
           <w:bCs/>
           <w:sz w:val="28"/>
           <w:szCs w:val="28"/>
         </w:rPr>
+      </w:pPr>
+      <w:r>
+        <w:rPr>
+          <w:b/>
+          <w:bCs/>
+          <w:sz w:val="28"/>
+          <w:szCs w:val="28"/>
+        </w:rPr>
         <w:t>Status:             Complete</w:t>
       </w:r>
     </w:p>
     <w:p>
       <w:pPr>
+        <w:rPr>
+          <w:b/>
+          <w:bCs/>
+          <w:sz w:val="28"/>
+          <w:szCs w:val="28"/>
+        </w:rPr>
+      </w:pPr>
+      <w:r>
+        <w:rPr>
+          <w:b/>
+          <w:bCs/>
+          <w:sz w:val="28"/>
+          <w:szCs w:val="28"/>
+        </w:rPr>
+        <w:br w:type="page"/>
+      </w:r>
+    </w:p>
+    <w:p>
+      <w:pPr>
         <w:jc w:val="center"/>
+        <w:rPr>
+          <w:b/>
+          <w:bCs/>
+          <w:sz w:val="28"/>
+          <w:szCs w:val="28"/>
+        </w:rPr>
       </w:pPr>
     </w:p>
     <w:p>
       <w:pPr>
         <w:jc w:val="center"/>
       </w:pPr>
+    </w:p>
+    <w:sdt>
+      <w:sdtPr>
+        <w:id w:val="-1923934932"/>
+        <w:docPartObj>
+          <w:docPartGallery w:val="Table of Contents"/>
+          <w:docPartUnique/>
+        </w:docPartObj>
+      </w:sdtPr>
+      <w:sdtEndPr>
+        <w:rPr>
+          <w:rFonts w:asciiTheme="minorHAnsi" w:eastAsiaTheme="minorHAnsi" w:hAnsiTheme="minorHAnsi" w:cstheme="minorBidi"/>
+          <w:b/>
+          <w:bCs/>
+          <w:noProof/>
+          <w:color w:val="auto"/>
+          <w:kern w:val="2"/>
+          <w:sz w:val="22"/>
+          <w:szCs w:val="22"/>
+          <w:lang w:val="en-GH"/>
+          <w14:ligatures w14:val="standardContextual"/>
+        </w:rPr>
+      </w:sdtEndPr>
+      <w:sdtContent>
+        <w:p>
+          <w:pPr>
+            <w:pStyle w:val="TOCHeading"/>
+          </w:pPr>
+          <w:r>
+            <w:t>Table of Contents</w:t>
+          </w:r>
+        </w:p>
+        <w:p>
+          <w:pPr>
+            <w:pStyle w:val="TOC1"/>
+            <w:tabs>
+              <w:tab w:val="right" w:leader="dot" w:pos="9016"/>
+            </w:tabs>
+            <w:rPr>
+              <w:noProof/>
+            </w:rPr>
+          </w:pPr>
+          <w:r>
+            <w:fldChar w:fldCharType="begin"/>
+          </w:r>
+          <w:r>
+            <w:instrText xml:space="preserve"> TOC \o "1-3" \h \z \u </w:instrText>
+          </w:r>
+          <w:r>
+            <w:fldChar w:fldCharType="separate"/>
+          </w:r>
+          <w:hyperlink w:anchor="_Toc229658361" w:history="1">
+            <w:r>
+              <w:rPr>
+                <w:rStyle w:val="Hyperlink"/>
+                <w:noProof/>
+              </w:rPr>
+              <w:t>1. EXECUTIVE SUMMARY</w:t>
+            </w:r>
+            <w:r>
+              <w:rPr>
+                <w:noProof/>
+                <w:webHidden/>
+              </w:rPr>
+              <w:tab/>
+            </w:r>
+            <w:r>
+              <w:rPr>
+                <w:noProof/>
+                <w:webHidden/>
+              </w:rPr>
+              <w:fldChar w:fldCharType="begin"/>
+            </w:r>
+            <w:r>
+              <w:rPr>
+                <w:noProof/>
+                <w:webHidden/>
+              </w:rPr>
+              <w:instrText xml:space="preserve"> PAGEREF _Toc229658361 \h </w:instrText>
+            </w:r>
+            <w:r>
+              <w:rPr>
+                <w:noProof/>
+                <w:webHidden/>
+              </w:rPr>
+            </w:r>
+            <w:r>
+              <w:rPr>
+                <w:noProof/>
+                <w:webHidden/>
+              </w:rPr>
+              <w:fldChar w:fldCharType="separate"/>
+            </w:r>
+            <w:r>
+              <w:rPr>
+                <w:noProof/>
+                <w:webHidden/>
+              </w:rPr>
+              <w:t>3</w:t>
+            </w:r>
+            <w:r>
+              <w:rPr>
+                <w:noProof/>
+                <w:webHidden/>
+              </w:rPr>
+              <w:fldChar w:fldCharType="end"/>
+            </w:r>
+          </w:hyperlink>
+        </w:p>
+        <w:p>
+          <w:pPr>
+            <w:pStyle w:val="TOC2"/>
+            <w:tabs>
+              <w:tab w:val="right" w:leader="dot" w:pos="9016"/>
+            </w:tabs>
+            <w:rPr>
+              <w:noProof/>
+            </w:rPr>
+          </w:pPr>
+          <w:hyperlink w:anchor="_Toc229658362" w:history="1">
+            <w:r>
+              <w:rPr>
+                <w:rStyle w:val="Hyperlink"/>
+                <w:noProof/>
+              </w:rPr>
+              <w:t>Key Achievements:</w:t>
+            </w:r>
+            <w:r>
+              <w:rPr>
+                <w:noProof/>
+                <w:webHidden/>
+              </w:rPr>
+              <w:tab/>
+            </w:r>
+            <w:r>
+              <w:rPr>
+                <w:noProof/>
+                <w:webHidden/>
+              </w:rPr>
+              <w:fldChar w:fldCharType="begin"/>
+            </w:r>
+            <w:r>
+              <w:rPr>
+                <w:noProof/>
+                <w:webHidden/>
+              </w:rPr>
+              <w:instrText xml:space="preserve"> PAGEREF _Toc229658362 \h </w:instrText>
+            </w:r>
+            <w:r>
+              <w:rPr>
+                <w:noProof/>
+                <w:webHidden/>
+              </w:rPr>
+            </w:r>
+            <w:r>
+              <w:rPr>
+                <w:noProof/>
+                <w:webHidden/>
+              </w:rPr>
+              <w:fldChar w:fldCharType="separate"/>
+            </w:r>
+            <w:r>
+              <w:rPr>
+                <w:noProof/>
+                <w:webHidden/>
+              </w:rPr>
+              <w:t>3</w:t>
+            </w:r>
+            <w:r>
+              <w:rPr>
+                <w:noProof/>
+                <w:webHidden/>
+              </w:rPr>
+              <w:fldChar w:fldCharType="end"/>
+            </w:r>
+          </w:hyperlink>
+        </w:p>
+        <w:p>
+          <w:pPr>
+            <w:pStyle w:val="TOC1"/>
+            <w:tabs>
+              <w:tab w:val="right" w:leader="dot" w:pos="9016"/>
+            </w:tabs>
+            <w:rPr>
+              <w:noProof/>
+            </w:rPr>
+          </w:pPr>
+          <w:hyperlink w:anchor="_Toc229658363" w:history="1">
+            <w:r>
+              <w:rPr>
+                <w:rStyle w:val="Hyperlink"/>
+                <w:noProof/>
+              </w:rPr>
+              <w:t>2. PROJECT OBJECTIVES</w:t>
+            </w:r>
+            <w:r>
+              <w:rPr>
+                <w:noProof/>
+                <w:webHidden/>
+              </w:rPr>
+              <w:tab/>
+            </w:r>
+            <w:r>
+              <w:rPr>
+                <w:noProof/>
+                <w:webHidden/>
+              </w:rPr>
+              <w:fldChar w:fldCharType="begin"/>
+            </w:r>
+            <w:r>
+              <w:rPr>
+                <w:noProof/>
+                <w:webHidden/>
+              </w:rPr>
+              <w:instrText xml:space="preserve"> PAGEREF _Toc229658363 \h </w:instrText>
+            </w:r>
+            <w:r>
+              <w:rPr>
+                <w:noProof/>
+                <w:webHidden/>
+              </w:rPr>
+            </w:r>
+            <w:r>
+              <w:rPr>
+                <w:noProof/>
+                <w:webHidden/>
+              </w:rPr>
+              <w:fldChar w:fldCharType="separate"/>
+            </w:r>
+            <w:r>
+              <w:rPr>
+                <w:noProof/>
+                <w:webHidden/>
+              </w:rPr>
+              <w:t>3</w:t>
+            </w:r>
+            <w:r>
+              <w:rPr>
+                <w:noProof/>
+                <w:webHidden/>
+              </w:rPr>
+              <w:fldChar w:fldCharType="end"/>
+            </w:r>
+          </w:hyperlink>
+        </w:p>
+        <w:p>
+          <w:pPr>
+            <w:pStyle w:val="TOC1"/>
+            <w:tabs>
+              <w:tab w:val="right" w:leader="dot" w:pos="9016"/>
+            </w:tabs>
+            <w:rPr>
+              <w:noProof/>
+            </w:rPr>
+          </w:pPr>
+          <w:hyperlink w:anchor="_Toc229658364" w:history="1">
+            <w:r>
+              <w:rPr>
+                <w:rStyle w:val="Hyperlink"/>
+                <w:noProof/>
+              </w:rPr>
+              <w:t>3. SCOPE OF WORK</w:t>
+            </w:r>
+            <w:r>
+              <w:rPr>
+                <w:noProof/>
+                <w:webHidden/>
+              </w:rPr>
+              <w:tab/>
+            </w:r>
+            <w:r>
+              <w:rPr>
+                <w:noProof/>
+                <w:webHidden/>
+              </w:rPr>
+              <w:fldChar w:fldCharType="begin"/>
+            </w:r>
+            <w:r>
+              <w:rPr>
+                <w:noProof/>
+                <w:webHidden/>
+              </w:rPr>
+              <w:instrText xml:space="preserve"> PAGEREF _Toc229658364 \h </w:instrText>
+            </w:r>
+            <w:r>
+              <w:rPr>
+                <w:noProof/>
+                <w:webHidden/>
+              </w:rPr>
+            </w:r>
+            <w:r>
+              <w:rPr>
+                <w:noProof/>
+                <w:webHidden/>
+              </w:rPr>
+              <w:fldChar w:fldCharType="separate"/>
+            </w:r>
+            <w:r>
+              <w:rPr>
+                <w:noProof/>
+                <w:webHidden/>
+              </w:rPr>
+              <w:t>4</w:t>
+            </w:r>
+            <w:r>
+              <w:rPr>
+                <w:noProof/>
+                <w:webHidden/>
+              </w:rPr>
+              <w:fldChar w:fldCharType="end"/>
+            </w:r>
+          </w:hyperlink>
+        </w:p>
+        <w:p>
+          <w:pPr>
+            <w:pStyle w:val="TOC2"/>
+            <w:tabs>
+              <w:tab w:val="right" w:leader="dot" w:pos="9016"/>
+            </w:tabs>
+            <w:rPr>
+              <w:noProof/>
+            </w:rPr>
+          </w:pPr>
+          <w:hyperlink w:anchor="_Toc229658365" w:history="1">
+            <w:r>
+              <w:rPr>
+                <w:rStyle w:val="Hyperlink"/>
+                <w:noProof/>
+              </w:rPr>
+              <w:t>3.1 IN SCOPE</w:t>
+            </w:r>
+            <w:r>
+              <w:rPr>
+                <w:noProof/>
+                <w:webHidden/>
+              </w:rPr>
+              <w:tab/>
+            </w:r>
+            <w:r>
+              <w:rPr>
+                <w:noProof/>
+                <w:webHidden/>
+              </w:rPr>
+              <w:fldChar w:fldCharType="begin"/>
+            </w:r>
+            <w:r>
+              <w:rPr>
+                <w:noProof/>
+                <w:webHidden/>
+              </w:rPr>
+              <w:instrText xml:space="preserve"> PAGEREF _Toc229658365 \h </w:instrText>
+            </w:r>
+            <w:r>
+              <w:rPr>
+                <w:noProof/>
+                <w:webHidden/>
+              </w:rPr>
+            </w:r>
+            <w:r>
+              <w:rPr>
+                <w:noProof/>
+                <w:webHidden/>
+              </w:rPr>
+              <w:fldChar w:fldCharType="separate"/>
+            </w:r>
+            <w:r>
+              <w:rPr>
+                <w:noProof/>
+                <w:webHidden/>
+              </w:rPr>
+              <w:t>4</w:t>
+            </w:r>
+            <w:r>
+              <w:rPr>
+                <w:noProof/>
+                <w:webHidden/>
+              </w:rPr>
+              <w:fldChar w:fldCharType="end"/>
+            </w:r>
+          </w:hyperlink>
+        </w:p>
+        <w:p>
+          <w:pPr>
+            <w:pStyle w:val="TOC2"/>
+            <w:tabs>
+              <w:tab w:val="right" w:leader="dot" w:pos="9016"/>
+            </w:tabs>
+            <w:rPr>
+              <w:noProof/>
+            </w:rPr>
+          </w:pPr>
+          <w:hyperlink w:anchor="_Toc229658366" w:history="1">
+            <w:r>
+              <w:rPr>
+                <w:rStyle w:val="Hyperlink"/>
+                <w:noProof/>
+              </w:rPr>
+              <w:t>3.2 OUT OF SCOPE</w:t>
+            </w:r>
+            <w:r>
+              <w:rPr>
+                <w:noProof/>
+                <w:webHidden/>
+              </w:rPr>
+              <w:tab/>
+            </w:r>
+            <w:r>
+              <w:rPr>
+                <w:noProof/>
+                <w:webHidden/>
+              </w:rPr>
+              <w:fldChar w:fldCharType="begin"/>
+            </w:r>
+            <w:r>
+              <w:rPr>
+                <w:noProof/>
+                <w:webHidden/>
+              </w:rPr>
+              <w:instrText xml:space="preserve"> PAGEREF _Toc229658366 \h </w:instrText>
+            </w:r>
+            <w:r>
+              <w:rPr>
+                <w:noProof/>
+                <w:webHidden/>
+              </w:rPr>
+            </w:r>
+            <w:r>
+              <w:rPr>
+                <w:noProof/>
+                <w:webHidden/>
+              </w:rPr>
+              <w:fldChar w:fldCharType="separate"/>
+            </w:r>
+            <w:r>
+              <w:rPr>
+                <w:noProof/>
+                <w:webHidden/>
+              </w:rPr>
+              <w:t>4</w:t>
+            </w:r>
+            <w:r>
+              <w:rPr>
+                <w:noProof/>
+                <w:webHidden/>
+              </w:rPr>
+              <w:fldChar w:fldCharType="end"/>
+            </w:r>
+          </w:hyperlink>
+        </w:p>
+        <w:p>
+          <w:pPr>
+            <w:pStyle w:val="TOC1"/>
+            <w:tabs>
+              <w:tab w:val="right" w:leader="dot" w:pos="9016"/>
+            </w:tabs>
+            <w:rPr>
+              <w:noProof/>
+            </w:rPr>
+          </w:pPr>
+          <w:hyperlink w:anchor="_Toc229658367" w:history="1">
+            <w:r>
+              <w:rPr>
+                <w:rStyle w:val="Hyperlink"/>
+                <w:noProof/>
+              </w:rPr>
+              <w:t>4. TOOLS &amp; TECHNOLOGIES</w:t>
+            </w:r>
+            <w:r>
+              <w:rPr>
+                <w:noProof/>
+                <w:webHidden/>
+              </w:rPr>
+              <w:tab/>
+            </w:r>
+            <w:r>
+              <w:rPr>
+                <w:noProof/>
+                <w:webHidden/>
+              </w:rPr>
+              <w:fldChar w:fldCharType="begin"/>
+            </w:r>
+            <w:r>
+              <w:rPr>
+                <w:noProof/>
+                <w:webHidden/>
+              </w:rPr>
+              <w:instrText xml:space="preserve"> PAGEREF _Toc229658367 \h </w:instrText>
+            </w:r>
+            <w:r>
+              <w:rPr>
+                <w:noProof/>
+                <w:webHidden/>
+              </w:rPr>
+            </w:r>
+            <w:r>
+              <w:rPr>
+                <w:noProof/>
+                <w:webHidden/>
+              </w:rPr>
+              <w:fldChar w:fldCharType="separate"/>
+            </w:r>
+            <w:r>
+              <w:rPr>
+                <w:noProof/>
+                <w:webHidden/>
+              </w:rPr>
+              <w:t>4</w:t>
+            </w:r>
+            <w:r>
+              <w:rPr>
+                <w:noProof/>
+                <w:webHidden/>
+              </w:rPr>
+              <w:fldChar w:fldCharType="end"/>
+            </w:r>
+          </w:hyperlink>
+        </w:p>
+        <w:p>
+          <w:pPr>
+            <w:pStyle w:val="TOC1"/>
+            <w:tabs>
+              <w:tab w:val="right" w:leader="dot" w:pos="9016"/>
+            </w:tabs>
+            <w:rPr>
+              <w:noProof/>
+            </w:rPr>
+          </w:pPr>
+          <w:hyperlink w:anchor="_Toc229658368" w:history="1">
+            <w:r>
+              <w:rPr>
+                <w:rStyle w:val="Hyperlink"/>
+                <w:noProof/>
+              </w:rPr>
+              <w:t>5. ARCHITECTURE &amp; FRAMEWORK DESIGN</w:t>
+            </w:r>
+            <w:r>
+              <w:rPr>
+                <w:noProof/>
+                <w:webHidden/>
+              </w:rPr>
+              <w:tab/>
+            </w:r>
+            <w:r>
+              <w:rPr>
+                <w:noProof/>
+                <w:webHidden/>
+              </w:rPr>
+              <w:fldChar w:fldCharType="begin"/>
+            </w:r>
+            <w:r>
+              <w:rPr>
+                <w:noProof/>
+                <w:webHidden/>
+              </w:rPr>
+              <w:instrText xml:space="preserve"> PAGEREF _Toc229658368 \h </w:instrText>
+            </w:r>
+            <w:r>
+              <w:rPr>
+                <w:noProof/>
+                <w:webHidden/>
+              </w:rPr>
+            </w:r>
+            <w:r>
+              <w:rPr>
+                <w:noProof/>
+                <w:webHidden/>
+              </w:rPr>
+              <w:fldChar w:fldCharType="separate"/>
+            </w:r>
+            <w:r>
+              <w:rPr>
+                <w:noProof/>
+                <w:webHidden/>
+              </w:rPr>
+              <w:t>5</w:t>
+            </w:r>
+            <w:r>
+              <w:rPr>
+                <w:noProof/>
+                <w:webHidden/>
+              </w:rPr>
+              <w:fldChar w:fldCharType="end"/>
+            </w:r>
+          </w:hyperlink>
+        </w:p>
+        <w:p>
+          <w:pPr>
+            <w:pStyle w:val="TOC2"/>
+            <w:tabs>
+              <w:tab w:val="right" w:leader="dot" w:pos="9016"/>
+            </w:tabs>
+            <w:rPr>
+              <w:noProof/>
+            </w:rPr>
+          </w:pPr>
+          <w:hyperlink w:anchor="_Toc229658369" w:history="1">
+            <w:r>
+              <w:rPr>
+                <w:rStyle w:val="Hyperlink"/>
+                <w:noProof/>
+              </w:rPr>
+              <w:t>5.1 PAGE OBJECT MODEL (POM)</w:t>
+            </w:r>
+            <w:r>
+              <w:rPr>
+                <w:noProof/>
+                <w:webHidden/>
+              </w:rPr>
+              <w:tab/>
+            </w:r>
+            <w:r>
+              <w:rPr>
+                <w:noProof/>
+                <w:webHidden/>
+              </w:rPr>
+              <w:fldChar w:fldCharType="begin"/>
+            </w:r>
+            <w:r>
+              <w:rPr>
+                <w:noProof/>
+                <w:webHidden/>
+              </w:rPr>
+              <w:instrText xml:space="preserve"> PAGEREF _Toc229658369 \h </w:instrText>
+            </w:r>
+            <w:r>
+              <w:rPr>
+                <w:noProof/>
+                <w:webHidden/>
+              </w:rPr>
+            </w:r>
+            <w:r>
+              <w:rPr>
+                <w:noProof/>
+                <w:webHidden/>
+              </w:rPr>
+              <w:fldChar w:fldCharType="separate"/>
+            </w:r>
+            <w:r>
+              <w:rPr>
+                <w:noProof/>
+                <w:webHidden/>
+              </w:rPr>
+              <w:t>5</w:t>
+            </w:r>
+            <w:r>
+              <w:rPr>
+                <w:noProof/>
+                <w:webHidden/>
+              </w:rPr>
+              <w:fldChar w:fldCharType="end"/>
+            </w:r>
+          </w:hyperlink>
+        </w:p>
+        <w:p>
+          <w:pPr>
+            <w:pStyle w:val="TOC2"/>
+            <w:tabs>
+              <w:tab w:val="right" w:leader="dot" w:pos="9016"/>
+            </w:tabs>
+            <w:rPr>
+              <w:noProof/>
+            </w:rPr>
+          </w:pPr>
+          <w:hyperlink w:anchor="_Toc229658370" w:history="1">
+            <w:r>
+              <w:rPr>
+                <w:rStyle w:val="Hyperlink"/>
+                <w:noProof/>
+                <w:lang w:val="de-DE"/>
+              </w:rPr>
+              <w:t>5.2 FOLDER STRUCTURE</w:t>
+            </w:r>
+            <w:r>
+              <w:rPr>
+                <w:noProof/>
+                <w:webHidden/>
+              </w:rPr>
+              <w:tab/>
+            </w:r>
+            <w:r>
+              <w:rPr>
+                <w:noProof/>
+                <w:webHidden/>
+              </w:rPr>
+              <w:fldChar w:fldCharType="begin"/>
+            </w:r>
+            <w:r>
+              <w:rPr>
+                <w:noProof/>
+                <w:webHidden/>
+              </w:rPr>
+              <w:instrText xml:space="preserve"> PAGEREF _Toc229658370 \h </w:instrText>
+            </w:r>
+            <w:r>
+              <w:rPr>
+                <w:noProof/>
+                <w:webHidden/>
+              </w:rPr>
+            </w:r>
+            <w:r>
+              <w:rPr>
+                <w:noProof/>
+                <w:webHidden/>
+              </w:rPr>
+              <w:fldChar w:fldCharType="separate"/>
+            </w:r>
+            <w:r>
+              <w:rPr>
+                <w:noProof/>
+                <w:webHidden/>
+              </w:rPr>
+              <w:t>5</w:t>
+            </w:r>
+            <w:r>
+              <w:rPr>
+                <w:noProof/>
+                <w:webHidden/>
+              </w:rPr>
+              <w:fldChar w:fldCharType="end"/>
+            </w:r>
+          </w:hyperlink>
+        </w:p>
+        <w:p>
+          <w:pPr>
+            <w:pStyle w:val="TOC2"/>
+            <w:tabs>
+              <w:tab w:val="right" w:leader="dot" w:pos="9016"/>
+            </w:tabs>
+            <w:rPr>
+              <w:noProof/>
+            </w:rPr>
+          </w:pPr>
+          <w:hyperlink w:anchor="_Toc229658371" w:history="1">
+            <w:r>
+              <w:rPr>
+                <w:rStyle w:val="Hyperlink"/>
+                <w:noProof/>
+              </w:rPr>
+              <w:t>5.3 DESIGN PATTERNS APPLIED</w:t>
+            </w:r>
+            <w:r>
+              <w:rPr>
+                <w:noProof/>
+                <w:webHidden/>
+              </w:rPr>
+              <w:tab/>
+            </w:r>
+            <w:r>
+              <w:rPr>
+                <w:noProof/>
+                <w:webHidden/>
+              </w:rPr>
+              <w:fldChar w:fldCharType="begin"/>
+            </w:r>
+            <w:r>
+              <w:rPr>
+                <w:noProof/>
+                <w:webHidden/>
+              </w:rPr>
+              <w:instrText xml:space="preserve"> PAGEREF _Toc229658371 \h </w:instrText>
+            </w:r>
+            <w:r>
+              <w:rPr>
+                <w:noProof/>
+                <w:webHidden/>
+              </w:rPr>
+            </w:r>
+            <w:r>
+              <w:rPr>
+                <w:noProof/>
+                <w:webHidden/>
+              </w:rPr>
+              <w:fldChar w:fldCharType="separate"/>
+            </w:r>
+            <w:r>
+              <w:rPr>
+                <w:noProof/>
+                <w:webHidden/>
+              </w:rPr>
+              <w:t>6</w:t>
+            </w:r>
+            <w:r>
+              <w:rPr>
+                <w:noProof/>
+                <w:webHidden/>
+              </w:rPr>
+              <w:fldChar w:fldCharType="end"/>
+            </w:r>
+          </w:hyperlink>
+        </w:p>
+        <w:p>
+          <w:pPr>
+            <w:pStyle w:val="TOC1"/>
+            <w:tabs>
+              <w:tab w:val="right" w:leader="dot" w:pos="9016"/>
+            </w:tabs>
+            <w:rPr>
+              <w:noProof/>
+            </w:rPr>
+          </w:pPr>
+          <w:hyperlink w:anchor="_Toc229658372" w:history="1">
+            <w:r>
+              <w:rPr>
+                <w:rStyle w:val="Hyperlink"/>
+                <w:noProof/>
+              </w:rPr>
+              <w:t>6. TEST COVERAGE SUMMARY</w:t>
+            </w:r>
+            <w:r>
+              <w:rPr>
+                <w:noProof/>
+                <w:webHidden/>
+              </w:rPr>
+              <w:tab/>
+            </w:r>
+            <w:r>
+              <w:rPr>
+                <w:noProof/>
+                <w:webHidden/>
+              </w:rPr>
+              <w:fldChar w:fldCharType="begin"/>
+            </w:r>
+            <w:r>
+              <w:rPr>
+                <w:noProof/>
+                <w:webHidden/>
+              </w:rPr>
+              <w:instrText xml:space="preserve"> PAGEREF _Toc229658372 \h </w:instrText>
+            </w:r>
+            <w:r>
+              <w:rPr>
+                <w:noProof/>
+                <w:webHidden/>
+              </w:rPr>
+            </w:r>
+            <w:r>
+              <w:rPr>
+                <w:noProof/>
+                <w:webHidden/>
+              </w:rPr>
+              <w:fldChar w:fldCharType="separate"/>
+            </w:r>
+            <w:r>
+              <w:rPr>
+                <w:noProof/>
+                <w:webHidden/>
+              </w:rPr>
+              <w:t>7</w:t>
+            </w:r>
+            <w:r>
+              <w:rPr>
+                <w:noProof/>
+                <w:webHidden/>
+              </w:rPr>
+              <w:fldChar w:fldCharType="end"/>
+            </w:r>
+          </w:hyperlink>
+        </w:p>
+        <w:p>
+          <w:pPr>
+            <w:pStyle w:val="TOC2"/>
+            <w:tabs>
+              <w:tab w:val="right" w:leader="dot" w:pos="9016"/>
+            </w:tabs>
+            <w:rPr>
+              <w:noProof/>
+            </w:rPr>
+          </w:pPr>
+          <w:hyperlink w:anchor="_Toc229658373" w:history="1">
+            <w:r>
+              <w:rPr>
+                <w:rStyle w:val="Hyperlink"/>
+                <w:noProof/>
+              </w:rPr>
+              <w:t>6.1 SMOKE TEST SUITE (@smoke)</w:t>
+            </w:r>
+            <w:r>
+              <w:rPr>
+                <w:noProof/>
+                <w:webHidden/>
+              </w:rPr>
+              <w:tab/>
+            </w:r>
+            <w:r>
+              <w:rPr>
+                <w:noProof/>
+                <w:webHidden/>
+              </w:rPr>
+              <w:fldChar w:fldCharType="begin"/>
+            </w:r>
+            <w:r>
+              <w:rPr>
+                <w:noProof/>
+                <w:webHidden/>
+              </w:rPr>
+              <w:instrText xml:space="preserve"> PAGEREF _Toc229658373 \h </w:instrText>
+            </w:r>
+            <w:r>
+              <w:rPr>
+                <w:noProof/>
+                <w:webHidden/>
+              </w:rPr>
+            </w:r>
+            <w:r>
+              <w:rPr>
+                <w:noProof/>
+                <w:webHidden/>
+              </w:rPr>
+              <w:fldChar w:fldCharType="separate"/>
+            </w:r>
+            <w:r>
+              <w:rPr>
+                <w:noProof/>
+                <w:webHidden/>
+              </w:rPr>
+              <w:t>7</w:t>
+            </w:r>
+            <w:r>
+              <w:rPr>
+                <w:noProof/>
+                <w:webHidden/>
+              </w:rPr>
+              <w:fldChar w:fldCharType="end"/>
+            </w:r>
+          </w:hyperlink>
+        </w:p>
+        <w:p>
+          <w:pPr>
+            <w:pStyle w:val="TOC2"/>
+            <w:tabs>
+              <w:tab w:val="right" w:leader="dot" w:pos="9016"/>
+            </w:tabs>
+            <w:rPr>
+              <w:noProof/>
+            </w:rPr>
+          </w:pPr>
+          <w:hyperlink w:anchor="_Toc229658374" w:history="1">
+            <w:r>
+              <w:rPr>
+                <w:rStyle w:val="Hyperlink"/>
+                <w:noProof/>
+              </w:rPr>
+              <w:t>6.2 REGRESSION TEST SUITE (@regression)</w:t>
+            </w:r>
+            <w:r>
+              <w:rPr>
+                <w:noProof/>
+                <w:webHidden/>
+              </w:rPr>
+              <w:tab/>
+            </w:r>
+            <w:r>
+              <w:rPr>
+                <w:noProof/>
+                <w:webHidden/>
+              </w:rPr>
+              <w:fldChar w:fldCharType="begin"/>
+            </w:r>
+            <w:r>
+              <w:rPr>
+                <w:noProof/>
+                <w:webHidden/>
+              </w:rPr>
+              <w:instrText xml:space="preserve"> PAGEREF _Toc229658374 \h </w:instrText>
+            </w:r>
+            <w:r>
+              <w:rPr>
+                <w:noProof/>
+                <w:webHidden/>
+              </w:rPr>
+            </w:r>
+            <w:r>
+              <w:rPr>
+                <w:noProof/>
+                <w:webHidden/>
+              </w:rPr>
+              <w:fldChar w:fldCharType="separate"/>
+            </w:r>
+            <w:r>
+              <w:rPr>
+                <w:noProof/>
+                <w:webHidden/>
+              </w:rPr>
+              <w:t>7</w:t>
+            </w:r>
+            <w:r>
+              <w:rPr>
+                <w:noProof/>
+                <w:webHidden/>
+              </w:rPr>
+              <w:fldChar w:fldCharType="end"/>
+            </w:r>
+          </w:hyperlink>
+        </w:p>
+        <w:p>
+          <w:pPr>
+            <w:pStyle w:val="TOC1"/>
+            <w:tabs>
+              <w:tab w:val="right" w:leader="dot" w:pos="9016"/>
+            </w:tabs>
+            <w:rPr>
+              <w:noProof/>
+            </w:rPr>
+          </w:pPr>
+          <w:hyperlink w:anchor="_Toc229658375" w:history="1">
+            <w:r>
+              <w:rPr>
+                <w:rStyle w:val="Hyperlink"/>
+                <w:noProof/>
+              </w:rPr>
+              <w:t>7. TEST EXECUTION RESULTS</w:t>
+            </w:r>
+            <w:r>
+              <w:rPr>
+                <w:noProof/>
+                <w:webHidden/>
+              </w:rPr>
+              <w:tab/>
+            </w:r>
+            <w:r>
+              <w:rPr>
+                <w:noProof/>
+                <w:webHidden/>
+              </w:rPr>
+              <w:fldChar w:fldCharType="begin"/>
+            </w:r>
+            <w:r>
+              <w:rPr>
+                <w:noProof/>
+                <w:webHidden/>
+              </w:rPr>
+              <w:instrText xml:space="preserve"> PAGEREF _Toc229658375 \h </w:instrText>
+            </w:r>
+            <w:r>
+              <w:rPr>
+                <w:noProof/>
+                <w:webHidden/>
+              </w:rPr>
+            </w:r>
+            <w:r>
+              <w:rPr>
+                <w:noProof/>
+                <w:webHidden/>
+              </w:rPr>
+              <w:fldChar w:fldCharType="separate"/>
+            </w:r>
+            <w:r>
+              <w:rPr>
+                <w:noProof/>
+                <w:webHidden/>
+              </w:rPr>
+              <w:t>8</w:t>
+            </w:r>
+            <w:r>
+              <w:rPr>
+                <w:noProof/>
+                <w:webHidden/>
+              </w:rPr>
+              <w:fldChar w:fldCharType="end"/>
+            </w:r>
+          </w:hyperlink>
+        </w:p>
+        <w:p>
+          <w:pPr>
+            <w:pStyle w:val="TOC1"/>
+            <w:tabs>
+              <w:tab w:val="right" w:leader="dot" w:pos="9016"/>
+            </w:tabs>
+            <w:rPr>
+              <w:noProof/>
+            </w:rPr>
+          </w:pPr>
+          <w:hyperlink w:anchor="_Toc229658376" w:history="1">
+            <w:r>
+              <w:rPr>
+                <w:rStyle w:val="Hyperlink"/>
+                <w:noProof/>
+              </w:rPr>
+              <w:t>8. REPORTING &amp; METRICS</w:t>
+            </w:r>
+            <w:r>
+              <w:rPr>
+                <w:noProof/>
+                <w:webHidden/>
+              </w:rPr>
+              <w:tab/>
+            </w:r>
+            <w:r>
+              <w:rPr>
+                <w:noProof/>
+                <w:webHidden/>
+              </w:rPr>
+              <w:fldChar w:fldCharType="begin"/>
+            </w:r>
+            <w:r>
+              <w:rPr>
+                <w:noProof/>
+                <w:webHidden/>
+              </w:rPr>
+              <w:instrText xml:space="preserve"> PAGEREF _Toc229658376 \h </w:instrText>
+            </w:r>
+            <w:r>
+              <w:rPr>
+                <w:noProof/>
+                <w:webHidden/>
+              </w:rPr>
+            </w:r>
+            <w:r>
+              <w:rPr>
+                <w:noProof/>
+                <w:webHidden/>
+              </w:rPr>
+              <w:fldChar w:fldCharType="separate"/>
+            </w:r>
+            <w:r>
+              <w:rPr>
+                <w:noProof/>
+                <w:webHidden/>
+              </w:rPr>
+              <w:t>8</w:t>
+            </w:r>
+            <w:r>
+              <w:rPr>
+                <w:noProof/>
+                <w:webHidden/>
+              </w:rPr>
+              <w:fldChar w:fldCharType="end"/>
+            </w:r>
+          </w:hyperlink>
+        </w:p>
+        <w:p>
+          <w:pPr>
+            <w:pStyle w:val="TOC2"/>
+            <w:tabs>
+              <w:tab w:val="right" w:leader="dot" w:pos="9016"/>
+            </w:tabs>
+            <w:rPr>
+              <w:noProof/>
+            </w:rPr>
+          </w:pPr>
+          <w:hyperlink w:anchor="_Toc229658377" w:history="1">
+            <w:r>
+              <w:rPr>
+                <w:rStyle w:val="Hyperlink"/>
+                <w:noProof/>
+              </w:rPr>
+              <w:t>8.1 ALLURE REPORT FEATURES</w:t>
+            </w:r>
+            <w:r>
+              <w:rPr>
+                <w:noProof/>
+                <w:webHidden/>
+              </w:rPr>
+              <w:tab/>
+            </w:r>
+            <w:r>
+              <w:rPr>
+                <w:noProof/>
+                <w:webHidden/>
+              </w:rPr>
+              <w:fldChar w:fldCharType="begin"/>
+            </w:r>
+            <w:r>
+              <w:rPr>
+                <w:noProof/>
+                <w:webHidden/>
+              </w:rPr>
+              <w:instrText xml:space="preserve"> PAGEREF _Toc229658377 \h </w:instrText>
+            </w:r>
+            <w:r>
+              <w:rPr>
+                <w:noProof/>
+                <w:webHidden/>
+              </w:rPr>
+            </w:r>
+            <w:r>
+              <w:rPr>
+                <w:noProof/>
+                <w:webHidden/>
+              </w:rPr>
+              <w:fldChar w:fldCharType="separate"/>
+            </w:r>
+            <w:r>
+              <w:rPr>
+                <w:noProof/>
+                <w:webHidden/>
+              </w:rPr>
+              <w:t>8</w:t>
+            </w:r>
+            <w:r>
+              <w:rPr>
+                <w:noProof/>
+                <w:webHidden/>
+              </w:rPr>
+              <w:fldChar w:fldCharType="end"/>
+            </w:r>
+          </w:hyperlink>
+        </w:p>
+        <w:p>
+          <w:pPr>
+            <w:pStyle w:val="TOC2"/>
+            <w:tabs>
+              <w:tab w:val="right" w:leader="dot" w:pos="9016"/>
+            </w:tabs>
+            <w:rPr>
+              <w:noProof/>
+            </w:rPr>
+          </w:pPr>
+          <w:hyperlink w:anchor="_Toc229658378" w:history="1">
+            <w:r>
+              <w:rPr>
+                <w:rStyle w:val="Hyperlink"/>
+                <w:noProof/>
+              </w:rPr>
+              <w:t>8.2 METRICS ACHIEVED</w:t>
+            </w:r>
+            <w:r>
+              <w:rPr>
+                <w:noProof/>
+                <w:webHidden/>
+              </w:rPr>
+              <w:tab/>
+            </w:r>
+            <w:r>
+              <w:rPr>
+                <w:noProof/>
+                <w:webHidden/>
+              </w:rPr>
+              <w:fldChar w:fldCharType="begin"/>
+            </w:r>
+            <w:r>
+              <w:rPr>
+                <w:noProof/>
+                <w:webHidden/>
+              </w:rPr>
+              <w:instrText xml:space="preserve"> PAGEREF _Toc229658378 \h </w:instrText>
+            </w:r>
+            <w:r>
+              <w:rPr>
+                <w:noProof/>
+                <w:webHidden/>
+              </w:rPr>
+            </w:r>
+            <w:r>
+              <w:rPr>
+                <w:noProof/>
+                <w:webHidden/>
+              </w:rPr>
+              <w:fldChar w:fldCharType="separate"/>
+            </w:r>
+            <w:r>
+              <w:rPr>
+                <w:noProof/>
+                <w:webHidden/>
+              </w:rPr>
+              <w:t>9</w:t>
+            </w:r>
+            <w:r>
+              <w:rPr>
+                <w:noProof/>
+                <w:webHidden/>
+              </w:rPr>
+              <w:fldChar w:fldCharType="end"/>
+            </w:r>
+          </w:hyperlink>
+        </w:p>
+        <w:p>
+          <w:r>
+            <w:rPr>
+              <w:b/>
+              <w:bCs/>
+              <w:noProof/>
+            </w:rPr>
+            <w:fldChar w:fldCharType="end"/>
+          </w:r>
+        </w:p>
+      </w:sdtContent>
+    </w:sdt>
+    <w:p>
+      <w:pPr>
+        <w:jc w:val="center"/>
+      </w:pPr>
       <w:r>
         <w:br w:type="page"/>
       </w:r>
@@ -277,6 +1593,7 @@
       <w:pPr>
         <w:pStyle w:val="Heading1"/>
       </w:pPr>
+      <w:bookmarkStart w:id="0" w:name="_Toc229658361"/>
       <w:r>
         <w:lastRenderedPageBreak/>
         <w:t xml:space="preserve">1. </w:t>
@@ -284,6 +1601,7 @@
       <w:r>
         <w:t>EXECUTIVE SUMMARY</w:t>
       </w:r>
+      <w:bookmarkEnd w:id="0"/>
     </w:p>
     <w:p>
       <w:r>
@@ -291,13 +1609,7 @@
       </w:r>
       <w:proofErr w:type="gramStart"/>
       <w:r>
-        <w:t xml:space="preserve">automation </w:t>
-      </w:r>
-      <w:r>
-        <w:t xml:space="preserve"> </w:t>
-      </w:r>
-      <w:r>
-        <w:t>pipeline</w:t>
+        <w:t>automation  pipeline</w:t>
       </w:r>
       <w:proofErr w:type="gramEnd"/>
       <w:r>
@@ -321,9 +1633,11 @@
       <w:pPr>
         <w:pStyle w:val="Heading2"/>
       </w:pPr>
+      <w:bookmarkStart w:id="1" w:name="_Toc229658362"/>
       <w:r>
         <w:t>Key Achievements:</w:t>
       </w:r>
+      <w:bookmarkEnd w:id="1"/>
     </w:p>
     <w:p>
       <w:pPr>
@@ -334,7 +1648,13 @@
         </w:numPr>
       </w:pPr>
       <w:r>
-        <w:t>18 automated test cases covering smoke and regression scenarios</w:t>
+        <w:t>1</w:t>
+      </w:r>
+      <w:r>
+        <w:t>4</w:t>
+      </w:r>
+      <w:r>
+        <w:t xml:space="preserve"> automated test cases covering smoke and regression scenarios</w:t>
       </w:r>
     </w:p>
     <w:p>
@@ -402,12 +1722,14 @@
       <w:pPr>
         <w:pStyle w:val="Heading1"/>
       </w:pPr>
+      <w:bookmarkStart w:id="2" w:name="_Toc229658363"/>
       <w:r>
         <w:t xml:space="preserve">2. </w:t>
       </w:r>
       <w:r>
         <w:t>PROJECT OBJECTIVES</w:t>
       </w:r>
+      <w:bookmarkEnd w:id="2"/>
     </w:p>
     <w:p>
       <w:r>
@@ -569,18 +1891,22 @@
       <w:pPr>
         <w:pStyle w:val="Heading1"/>
       </w:pPr>
+      <w:bookmarkStart w:id="3" w:name="_Toc229658364"/>
       <w:r>
         <w:lastRenderedPageBreak/>
         <w:t>3. SCOPE OF WORK</w:t>
       </w:r>
+      <w:bookmarkEnd w:id="3"/>
     </w:p>
     <w:p>
       <w:pPr>
         <w:pStyle w:val="Heading2"/>
       </w:pPr>
+      <w:bookmarkStart w:id="4" w:name="_Toc229658365"/>
       <w:r>
         <w:t>3.1 IN SCOPE</w:t>
       </w:r>
+      <w:bookmarkEnd w:id="4"/>
     </w:p>
     <w:p>
       <w:pPr>
@@ -723,9 +2049,11 @@
       <w:pPr>
         <w:pStyle w:val="Heading2"/>
       </w:pPr>
+      <w:bookmarkStart w:id="5" w:name="_Toc229658366"/>
       <w:r>
         <w:t>3.2 OUT OF SCOPE</w:t>
       </w:r>
+      <w:bookmarkEnd w:id="5"/>
     </w:p>
     <w:p>
       <w:pPr>
@@ -803,12 +2131,14 @@
       <w:pPr>
         <w:pStyle w:val="Heading1"/>
       </w:pPr>
+      <w:bookmarkStart w:id="6" w:name="_Toc229658367"/>
       <w:r>
         <w:t xml:space="preserve">4. </w:t>
       </w:r>
       <w:r>
         <w:t>TOOLS &amp; TECHNOLOGIES</w:t>
       </w:r>
+      <w:bookmarkEnd w:id="6"/>
     </w:p>
     <w:tbl>
       <w:tblPr>
@@ -1411,18 +2741,22 @@
       <w:pPr>
         <w:pStyle w:val="Heading1"/>
       </w:pPr>
+      <w:bookmarkStart w:id="7" w:name="_Toc229658368"/>
       <w:r>
         <w:lastRenderedPageBreak/>
         <w:t>5. ARCHITECTURE &amp; FRAMEWORK DESIGN</w:t>
       </w:r>
+      <w:bookmarkEnd w:id="7"/>
     </w:p>
     <w:p>
       <w:pPr>
         <w:pStyle w:val="Heading2"/>
       </w:pPr>
+      <w:bookmarkStart w:id="8" w:name="_Toc229658369"/>
       <w:r>
         <w:t>5.1 PAGE OBJECT MODEL (POM)</w:t>
       </w:r>
+      <w:bookmarkEnd w:id="8"/>
     </w:p>
     <w:p>
       <w:r>
@@ -1591,267 +2925,493 @@
     <w:p>
       <w:pPr>
         <w:pStyle w:val="Heading2"/>
-      </w:pPr>
-      <w:r>
+        <w:rPr>
+          <w:lang w:val="de-DE"/>
+        </w:rPr>
+      </w:pPr>
+      <w:bookmarkStart w:id="9" w:name="_Toc229658370"/>
+      <w:r>
+        <w:rPr>
+          <w:lang w:val="de-DE"/>
+        </w:rPr>
         <w:t>5.2 FOLDER STRUCTURE</w:t>
       </w:r>
-    </w:p>
-    <w:p>
+      <w:bookmarkEnd w:id="9"/>
+    </w:p>
+    <w:p>
+      <w:pPr>
+        <w:rPr>
+          <w:lang w:val="de-DE"/>
+        </w:rPr>
+      </w:pPr>
       <w:proofErr w:type="spellStart"/>
       <w:r>
+        <w:rPr>
+          <w:lang w:val="de-DE"/>
+        </w:rPr>
         <w:t>demoblaze-qa</w:t>
       </w:r>
       <w:proofErr w:type="spellEnd"/>
       <w:r>
+        <w:rPr>
+          <w:lang w:val="de-DE"/>
+        </w:rPr>
         <w:t>/</w:t>
       </w:r>
     </w:p>
     <w:p>
+      <w:pPr>
+        <w:rPr>
+          <w:lang w:val="de-DE"/>
+        </w:rPr>
+      </w:pPr>
       <w:r>
         <w:rPr>
           <w:rFonts w:ascii="MS Gothic" w:eastAsia="MS Gothic" w:hAnsi="MS Gothic" w:cs="MS Gothic" w:hint="eastAsia"/>
+          <w:lang w:val="de-DE"/>
         </w:rPr>
         <w:t>├</w:t>
       </w:r>
       <w:r>
         <w:rPr>
           <w:rFonts w:ascii="Aptos" w:hAnsi="Aptos" w:cs="Aptos"/>
+          <w:lang w:val="de-DE"/>
         </w:rPr>
         <w:t>──</w:t>
       </w:r>
       <w:r>
+        <w:rPr>
+          <w:lang w:val="de-DE"/>
+        </w:rPr>
         <w:t xml:space="preserve"> e2e/</w:t>
       </w:r>
     </w:p>
     <w:p>
-      <w:r>
+      <w:pPr>
+        <w:rPr>
+          <w:lang w:val="de-DE"/>
+        </w:rPr>
+      </w:pPr>
+      <w:r>
+        <w:rPr>
+          <w:lang w:val="de-DE"/>
+        </w:rPr>
         <w:t xml:space="preserve">│   </w:t>
       </w:r>
       <w:r>
         <w:rPr>
           <w:rFonts w:ascii="MS Gothic" w:eastAsia="MS Gothic" w:hAnsi="MS Gothic" w:cs="MS Gothic" w:hint="eastAsia"/>
+          <w:lang w:val="de-DE"/>
         </w:rPr>
         <w:t>├</w:t>
       </w:r>
       <w:r>
         <w:rPr>
           <w:rFonts w:ascii="Aptos" w:hAnsi="Aptos" w:cs="Aptos"/>
+          <w:lang w:val="de-DE"/>
         </w:rPr>
         <w:t>──</w:t>
       </w:r>
       <w:r>
-        <w:t xml:space="preserve"> fixtures/</w:t>
-      </w:r>
-    </w:p>
-    <w:p>
-      <w:r>
+        <w:rPr>
+          <w:lang w:val="de-DE"/>
+        </w:rPr>
+        <w:t xml:space="preserve"> </w:t>
+      </w:r>
+      <w:proofErr w:type="spellStart"/>
+      <w:r>
+        <w:rPr>
+          <w:lang w:val="de-DE"/>
+        </w:rPr>
+        <w:t>fixtures</w:t>
+      </w:r>
+      <w:proofErr w:type="spellEnd"/>
+      <w:r>
+        <w:rPr>
+          <w:lang w:val="de-DE"/>
+        </w:rPr>
+        <w:t>/</w:t>
+      </w:r>
+    </w:p>
+    <w:p>
+      <w:pPr>
+        <w:rPr>
+          <w:lang w:val="de-DE"/>
+        </w:rPr>
+      </w:pPr>
+      <w:r>
+        <w:rPr>
+          <w:lang w:val="de-DE"/>
+        </w:rPr>
         <w:t xml:space="preserve">│   │   └── </w:t>
       </w:r>
       <w:proofErr w:type="spellStart"/>
       <w:r>
+        <w:rPr>
+          <w:lang w:val="de-DE"/>
+        </w:rPr>
         <w:t>fixtures.ts</w:t>
       </w:r>
       <w:proofErr w:type="spellEnd"/>
       <w:r>
+        <w:rPr>
+          <w:lang w:val="de-DE"/>
+        </w:rPr>
         <w:t xml:space="preserve">  </w:t>
       </w:r>
       <w:r>
+        <w:rPr>
+          <w:lang w:val="de-DE"/>
+        </w:rPr>
         <w:t xml:space="preserve"> </w:t>
       </w:r>
     </w:p>
     <w:p>
-      <w:r>
+      <w:pPr>
+        <w:rPr>
+          <w:lang w:val="de-DE"/>
+        </w:rPr>
+      </w:pPr>
+      <w:r>
+        <w:rPr>
+          <w:lang w:val="de-DE"/>
+        </w:rPr>
         <w:t xml:space="preserve">│   </w:t>
       </w:r>
       <w:r>
         <w:rPr>
           <w:rFonts w:ascii="MS Gothic" w:eastAsia="MS Gothic" w:hAnsi="MS Gothic" w:cs="MS Gothic" w:hint="eastAsia"/>
+          <w:lang w:val="de-DE"/>
         </w:rPr>
         <w:t>├</w:t>
       </w:r>
       <w:r>
         <w:rPr>
           <w:rFonts w:ascii="Aptos" w:hAnsi="Aptos" w:cs="Aptos"/>
+          <w:lang w:val="de-DE"/>
         </w:rPr>
         <w:t>──</w:t>
       </w:r>
       <w:r>
+        <w:rPr>
+          <w:lang w:val="de-DE"/>
+        </w:rPr>
         <w:t xml:space="preserve"> </w:t>
       </w:r>
-      <w:r>
+      <w:proofErr w:type="spellStart"/>
+      <w:r>
+        <w:rPr>
+          <w:lang w:val="de-DE"/>
+        </w:rPr>
         <w:t>utils</w:t>
       </w:r>
-      <w:r>
+      <w:proofErr w:type="spellEnd"/>
+      <w:r>
+        <w:rPr>
+          <w:lang w:val="de-DE"/>
+        </w:rPr>
         <w:t>/</w:t>
       </w:r>
     </w:p>
     <w:p>
-      <w:r>
+      <w:pPr>
+        <w:rPr>
+          <w:lang w:val="de-DE"/>
+        </w:rPr>
+      </w:pPr>
+      <w:r>
+        <w:rPr>
+          <w:lang w:val="de-DE"/>
+        </w:rPr>
         <w:t>│   │   └── test-</w:t>
       </w:r>
       <w:proofErr w:type="spellStart"/>
       <w:proofErr w:type="gramStart"/>
       <w:r>
+        <w:rPr>
+          <w:lang w:val="de-DE"/>
+        </w:rPr>
         <w:t>data.json</w:t>
       </w:r>
       <w:proofErr w:type="spellEnd"/>
       <w:proofErr w:type="gramEnd"/>
       <w:r>
+        <w:rPr>
+          <w:lang w:val="de-DE"/>
+        </w:rPr>
         <w:t xml:space="preserve">          </w:t>
       </w:r>
     </w:p>
     <w:p>
-      <w:r>
+      <w:pPr>
+        <w:rPr>
+          <w:lang w:val="de-DE"/>
+        </w:rPr>
+      </w:pPr>
+      <w:r>
+        <w:rPr>
+          <w:lang w:val="de-DE"/>
+        </w:rPr>
         <w:t xml:space="preserve">│   </w:t>
       </w:r>
       <w:r>
         <w:rPr>
           <w:rFonts w:ascii="MS Gothic" w:eastAsia="MS Gothic" w:hAnsi="MS Gothic" w:cs="MS Gothic" w:hint="eastAsia"/>
+          <w:lang w:val="de-DE"/>
         </w:rPr>
         <w:t>├</w:t>
       </w:r>
       <w:r>
         <w:rPr>
           <w:rFonts w:ascii="Aptos" w:hAnsi="Aptos" w:cs="Aptos"/>
+          <w:lang w:val="de-DE"/>
         </w:rPr>
         <w:t>──</w:t>
       </w:r>
       <w:r>
-        <w:t xml:space="preserve"> page/</w:t>
-      </w:r>
-    </w:p>
-    <w:p>
-      <w:r>
+        <w:rPr>
+          <w:lang w:val="de-DE"/>
+        </w:rPr>
+        <w:t xml:space="preserve"> </w:t>
+      </w:r>
+      <w:proofErr w:type="spellStart"/>
+      <w:r>
+        <w:rPr>
+          <w:lang w:val="de-DE"/>
+        </w:rPr>
+        <w:t>page</w:t>
+      </w:r>
+      <w:proofErr w:type="spellEnd"/>
+      <w:r>
+        <w:rPr>
+          <w:lang w:val="de-DE"/>
+        </w:rPr>
+        <w:t>/</w:t>
+      </w:r>
+    </w:p>
+    <w:p>
+      <w:pPr>
+        <w:rPr>
+          <w:lang w:val="de-DE"/>
+        </w:rPr>
+      </w:pPr>
+      <w:r>
+        <w:rPr>
+          <w:lang w:val="de-DE"/>
+        </w:rPr>
         <w:t xml:space="preserve">│   │   </w:t>
       </w:r>
       <w:r>
         <w:rPr>
           <w:rFonts w:ascii="MS Gothic" w:eastAsia="MS Gothic" w:hAnsi="MS Gothic" w:cs="MS Gothic" w:hint="eastAsia"/>
+          <w:lang w:val="de-DE"/>
         </w:rPr>
         <w:t>├</w:t>
       </w:r>
       <w:r>
         <w:rPr>
           <w:rFonts w:ascii="Aptos" w:hAnsi="Aptos" w:cs="Aptos"/>
+          <w:lang w:val="de-DE"/>
         </w:rPr>
         <w:t>──</w:t>
       </w:r>
       <w:r>
+        <w:rPr>
+          <w:lang w:val="de-DE"/>
+        </w:rPr>
         <w:t xml:space="preserve"> </w:t>
       </w:r>
       <w:proofErr w:type="spellStart"/>
       <w:r>
+        <w:rPr>
+          <w:lang w:val="de-DE"/>
+        </w:rPr>
         <w:t>HomePage.ts</w:t>
       </w:r>
       <w:proofErr w:type="spellEnd"/>
     </w:p>
     <w:p>
-      <w:r>
+      <w:pPr>
+        <w:rPr>
+          <w:lang w:val="de-DE"/>
+        </w:rPr>
+      </w:pPr>
+      <w:r>
+        <w:rPr>
+          <w:lang w:val="de-DE"/>
+        </w:rPr>
         <w:t xml:space="preserve">│   │   </w:t>
       </w:r>
       <w:r>
         <w:rPr>
           <w:rFonts w:ascii="MS Gothic" w:eastAsia="MS Gothic" w:hAnsi="MS Gothic" w:cs="MS Gothic" w:hint="eastAsia"/>
+          <w:lang w:val="de-DE"/>
         </w:rPr>
         <w:t>├</w:t>
       </w:r>
       <w:r>
         <w:rPr>
           <w:rFonts w:ascii="Aptos" w:hAnsi="Aptos" w:cs="Aptos"/>
+          <w:lang w:val="de-DE"/>
         </w:rPr>
         <w:t>──</w:t>
       </w:r>
       <w:r>
+        <w:rPr>
+          <w:lang w:val="de-DE"/>
+        </w:rPr>
         <w:t xml:space="preserve"> </w:t>
       </w:r>
       <w:proofErr w:type="spellStart"/>
       <w:r>
+        <w:rPr>
+          <w:lang w:val="de-DE"/>
+        </w:rPr>
         <w:t>LoginPage.ts</w:t>
       </w:r>
       <w:proofErr w:type="spellEnd"/>
     </w:p>
     <w:p>
-      <w:r>
+      <w:pPr>
+        <w:rPr>
+          <w:lang w:val="de-DE"/>
+        </w:rPr>
+      </w:pPr>
+      <w:r>
+        <w:rPr>
+          <w:lang w:val="de-DE"/>
+        </w:rPr>
         <w:t xml:space="preserve">│   │   </w:t>
       </w:r>
       <w:r>
         <w:rPr>
           <w:rFonts w:ascii="MS Gothic" w:eastAsia="MS Gothic" w:hAnsi="MS Gothic" w:cs="MS Gothic" w:hint="eastAsia"/>
+          <w:lang w:val="de-DE"/>
         </w:rPr>
         <w:t>├</w:t>
       </w:r>
       <w:r>
         <w:rPr>
           <w:rFonts w:ascii="Aptos" w:hAnsi="Aptos" w:cs="Aptos"/>
+          <w:lang w:val="de-DE"/>
         </w:rPr>
         <w:t>──</w:t>
       </w:r>
       <w:r>
+        <w:rPr>
+          <w:lang w:val="de-DE"/>
+        </w:rPr>
         <w:t xml:space="preserve"> </w:t>
       </w:r>
       <w:proofErr w:type="spellStart"/>
       <w:r>
+        <w:rPr>
+          <w:lang w:val="de-DE"/>
+        </w:rPr>
         <w:t>SignUpPage.ts</w:t>
       </w:r>
       <w:proofErr w:type="spellEnd"/>
     </w:p>
     <w:p>
-      <w:r>
+      <w:pPr>
+        <w:rPr>
+          <w:lang w:val="de-DE"/>
+        </w:rPr>
+      </w:pPr>
+      <w:r>
+        <w:rPr>
+          <w:lang w:val="de-DE"/>
+        </w:rPr>
         <w:t xml:space="preserve">│   │   </w:t>
       </w:r>
       <w:r>
         <w:rPr>
           <w:rFonts w:ascii="MS Gothic" w:eastAsia="MS Gothic" w:hAnsi="MS Gothic" w:cs="MS Gothic" w:hint="eastAsia"/>
+          <w:lang w:val="de-DE"/>
         </w:rPr>
         <w:t>├</w:t>
       </w:r>
       <w:r>
         <w:rPr>
           <w:rFonts w:ascii="Aptos" w:hAnsi="Aptos" w:cs="Aptos"/>
+          <w:lang w:val="de-DE"/>
         </w:rPr>
         <w:t>──</w:t>
       </w:r>
       <w:r>
+        <w:rPr>
+          <w:lang w:val="de-DE"/>
+        </w:rPr>
         <w:t xml:space="preserve"> </w:t>
       </w:r>
       <w:proofErr w:type="spellStart"/>
       <w:r>
+        <w:rPr>
+          <w:lang w:val="de-DE"/>
+        </w:rPr>
         <w:t>ProductPage.ts</w:t>
       </w:r>
       <w:proofErr w:type="spellEnd"/>
     </w:p>
     <w:p>
-      <w:r>
+      <w:pPr>
+        <w:rPr>
+          <w:lang w:val="de-DE"/>
+        </w:rPr>
+      </w:pPr>
+      <w:r>
+        <w:rPr>
+          <w:lang w:val="de-DE"/>
+        </w:rPr>
         <w:lastRenderedPageBreak/>
         <w:t xml:space="preserve">│   │   </w:t>
       </w:r>
       <w:r>
         <w:rPr>
           <w:rFonts w:ascii="MS Gothic" w:eastAsia="MS Gothic" w:hAnsi="MS Gothic" w:cs="MS Gothic" w:hint="eastAsia"/>
+          <w:lang w:val="de-DE"/>
         </w:rPr>
         <w:t>├</w:t>
       </w:r>
       <w:r>
         <w:rPr>
           <w:rFonts w:ascii="Aptos" w:hAnsi="Aptos" w:cs="Aptos"/>
+          <w:lang w:val="de-DE"/>
         </w:rPr>
         <w:t>──</w:t>
       </w:r>
       <w:r>
+        <w:rPr>
+          <w:lang w:val="de-DE"/>
+        </w:rPr>
         <w:t xml:space="preserve"> </w:t>
       </w:r>
       <w:proofErr w:type="spellStart"/>
       <w:r>
+        <w:rPr>
+          <w:lang w:val="de-DE"/>
+        </w:rPr>
         <w:t>CartPage.ts</w:t>
       </w:r>
       <w:proofErr w:type="spellEnd"/>
     </w:p>
     <w:p>
-      <w:r>
+      <w:pPr>
+        <w:rPr>
+          <w:lang w:val="de-DE"/>
+        </w:rPr>
+      </w:pPr>
+      <w:r>
+        <w:rPr>
+          <w:lang w:val="de-DE"/>
+        </w:rPr>
         <w:t xml:space="preserve">│   │   └── </w:t>
       </w:r>
       <w:proofErr w:type="spellStart"/>
       <w:r>
+        <w:rPr>
+          <w:lang w:val="de-DE"/>
+        </w:rPr>
         <w:t>CheckoutPage.ts</w:t>
       </w:r>
       <w:proofErr w:type="spellEnd"/>
@@ -2068,18 +3628,12 @@
         <w:t>──</w:t>
       </w:r>
       <w:r>
-        <w:t xml:space="preserve"> regression-</w:t>
-      </w:r>
-      <w:r>
-        <w:t>multiple-</w:t>
+        <w:t xml:space="preserve"> regression-multiple-</w:t>
       </w:r>
       <w:proofErr w:type="spellStart"/>
       <w:proofErr w:type="gramStart"/>
       <w:r>
-        <w:t>cart</w:t>
-      </w:r>
-      <w:r>
-        <w:t>.spec</w:t>
+        <w:t>cart.spec</w:t>
       </w:r>
       <w:proofErr w:type="gramEnd"/>
       <w:r>
@@ -2104,18 +3658,12 @@
         <w:t>──</w:t>
       </w:r>
       <w:r>
-        <w:t xml:space="preserve"> regression-</w:t>
-      </w:r>
-      <w:r>
-        <w:t>remove-</w:t>
+        <w:t xml:space="preserve"> regression-remove-</w:t>
       </w:r>
       <w:proofErr w:type="spellStart"/>
       <w:proofErr w:type="gramStart"/>
       <w:r>
-        <w:t>cart</w:t>
-      </w:r>
-      <w:r>
-        <w:t>.spec</w:t>
+        <w:t>cart.spec</w:t>
       </w:r>
       <w:proofErr w:type="gramEnd"/>
       <w:r>
@@ -2261,10 +3809,7 @@
         <w:t>──</w:t>
       </w:r>
       <w:r>
-        <w:t xml:space="preserve"> </w:t>
-      </w:r>
-      <w:r>
-        <w:t>Bug reporting</w:t>
+        <w:t xml:space="preserve"> Bug reporting</w:t>
       </w:r>
     </w:p>
     <w:p>
@@ -2281,13 +3826,7 @@
         <w:t>──</w:t>
       </w:r>
       <w:r>
-        <w:t xml:space="preserve"> </w:t>
-      </w:r>
-      <w:r>
-        <w:t>Text Plan outline</w:t>
-      </w:r>
-      <w:r>
-        <w:t xml:space="preserve">                                          </w:t>
+        <w:t xml:space="preserve"> Text Plan outline                                          </w:t>
       </w:r>
     </w:p>
     <w:p>
@@ -2410,9 +3949,11 @@
       <w:pPr>
         <w:pStyle w:val="Heading2"/>
       </w:pPr>
+      <w:bookmarkStart w:id="10" w:name="_Toc229658371"/>
       <w:r>
         <w:t>5.3 DESIGN PATTERNS APPLIED</w:t>
       </w:r>
+      <w:bookmarkEnd w:id="10"/>
       <w:r>
         <w:t xml:space="preserve">           </w:t>
       </w:r>
@@ -2475,17 +4016,21 @@
       <w:pPr>
         <w:pStyle w:val="Heading1"/>
       </w:pPr>
+      <w:bookmarkStart w:id="11" w:name="_Toc229658372"/>
       <w:r>
         <w:t>6. TEST COVERAGE SUMMARY</w:t>
       </w:r>
+      <w:bookmarkEnd w:id="11"/>
     </w:p>
     <w:p>
       <w:pPr>
         <w:pStyle w:val="Heading2"/>
       </w:pPr>
+      <w:bookmarkStart w:id="12" w:name="_Toc229658373"/>
       <w:r>
         <w:t>6.1 SMOKE TEST SUITE (@smoke)</w:t>
       </w:r>
+      <w:bookmarkEnd w:id="12"/>
     </w:p>
     <w:tbl>
       <w:tblPr>
@@ -2726,9 +4271,11 @@
       <w:pPr>
         <w:pStyle w:val="Heading2"/>
       </w:pPr>
+      <w:bookmarkStart w:id="13" w:name="_Toc229658374"/>
       <w:r>
         <w:t>6.2 REGRESSION TEST SUITE (@regression)</w:t>
       </w:r>
+      <w:bookmarkEnd w:id="13"/>
     </w:p>
     <w:tbl>
       <w:tblPr>
@@ -3011,10 +4558,7 @@
           </w:tcPr>
           <w:p>
             <w:r>
-              <w:t>TC-REG-00</w:t>
-            </w:r>
-            <w:r>
-              <w:t>7</w:t>
+              <w:t>TC-REG-007</w:t>
             </w:r>
           </w:p>
         </w:tc>
@@ -3049,10 +4593,7 @@
           </w:tcPr>
           <w:p>
             <w:r>
-              <w:t>TC-REG-00</w:t>
-            </w:r>
-            <w:r>
-              <w:t>8</w:t>
+              <w:t>TC-REG-008</w:t>
             </w:r>
           </w:p>
         </w:tc>
@@ -3087,10 +4628,7 @@
           </w:tcPr>
           <w:p>
             <w:r>
-              <w:t>TC-REG-00</w:t>
-            </w:r>
-            <w:r>
-              <w:t>9</w:t>
+              <w:t>TC-REG-009</w:t>
             </w:r>
           </w:p>
         </w:tc>
@@ -3125,10 +4663,7 @@
           </w:tcPr>
           <w:p>
             <w:r>
-              <w:t>TC-REG-0</w:t>
-            </w:r>
-            <w:r>
-              <w:t>10</w:t>
+              <w:t>TC-REG-010</w:t>
             </w:r>
           </w:p>
         </w:tc>
@@ -3173,10 +4708,12 @@
       <w:pPr>
         <w:pStyle w:val="Heading1"/>
       </w:pPr>
+      <w:bookmarkStart w:id="14" w:name="_Toc229658375"/>
       <w:r>
         <w:lastRenderedPageBreak/>
         <w:t>7. TEST EXECUTION RESULTS</w:t>
       </w:r>
+      <w:bookmarkEnd w:id="14"/>
     </w:p>
     <w:p>
       <w:r>
@@ -3185,26 +4722,17 @@
     </w:p>
     <w:p>
       <w:r>
-        <w:t>Environment: VS Code, Node.js 20.x, Chrom</w:t>
-      </w:r>
-      <w:r>
-        <w:t>e</w:t>
-      </w:r>
-    </w:p>
-    <w:p>
-      <w:r>
-        <w:t xml:space="preserve">Total Tests: </w:t>
-      </w:r>
-      <w:r>
-        <w:t>14</w:t>
-      </w:r>
-    </w:p>
-    <w:p>
-      <w:r>
-        <w:t xml:space="preserve">Passed:      </w:t>
-      </w:r>
-      <w:r>
-        <w:t>14</w:t>
+        <w:t>Environment: VS Code, Node.js 20.x, Chrome</w:t>
+      </w:r>
+    </w:p>
+    <w:p>
+      <w:r>
+        <w:t>Total Tests: 14</w:t>
+      </w:r>
+    </w:p>
+    <w:p>
+      <w:r>
+        <w:t>Passed:      14</w:t>
       </w:r>
     </w:p>
     <w:p>
@@ -3240,18 +4768,12 @@
     </w:p>
     <w:p>
       <w:r>
-        <w:t xml:space="preserve">Total Tests: </w:t>
-      </w:r>
-      <w:r>
-        <w:t>14</w:t>
-      </w:r>
-    </w:p>
-    <w:p>
-      <w:r>
-        <w:t xml:space="preserve">Passed:      </w:t>
-      </w:r>
-      <w:r>
-        <w:t>14</w:t>
+        <w:t>Total Tests: 14</w:t>
+      </w:r>
+    </w:p>
+    <w:p>
+      <w:r>
+        <w:t>Passed:      14</w:t>
       </w:r>
     </w:p>
     <w:p>
@@ -3274,23 +4796,24 @@
       <w:pPr>
         <w:pStyle w:val="Heading1"/>
       </w:pPr>
+      <w:bookmarkStart w:id="15" w:name="_Toc229658376"/>
       <w:r>
         <w:t>8</w:t>
       </w:r>
       <w:r>
         <w:t>. REPORTING &amp; METRICS</w:t>
       </w:r>
+      <w:bookmarkEnd w:id="15"/>
     </w:p>
     <w:p>
       <w:pPr>
         <w:pStyle w:val="Heading2"/>
       </w:pPr>
-      <w:r>
-        <w:t>8.1</w:t>
-      </w:r>
-      <w:r>
-        <w:t xml:space="preserve"> ALLURE REPORT FEATURES</w:t>
-      </w:r>
+      <w:bookmarkStart w:id="16" w:name="_Toc229658377"/>
+      <w:r>
+        <w:t>8.1 ALLURE REPORT FEATURES</w:t>
+      </w:r>
+      <w:bookmarkEnd w:id="16"/>
     </w:p>
     <w:p>
       <w:r>
@@ -3393,6 +4916,7 @@
       <w:pPr>
         <w:pStyle w:val="Heading2"/>
       </w:pPr>
+      <w:bookmarkStart w:id="17" w:name="_Toc229658378"/>
       <w:r>
         <w:lastRenderedPageBreak/>
         <w:t>8</w:t>
@@ -3400,6 +4924,7 @@
       <w:r>
         <w:t>.2 METRICS ACHIEVED</w:t>
       </w:r>
+      <w:bookmarkEnd w:id="17"/>
     </w:p>
     <w:tbl>
       <w:tblPr>
@@ -3766,7 +5291,10 @@
           </w:tcPr>
           <w:p>
             <w:r>
-              <w:t>0%</w:t>
+              <w:t>1</w:t>
+            </w:r>
+            <w:r>
+              <w:t>%</w:t>
             </w:r>
           </w:p>
         </w:tc>
@@ -5954,6 +7482,7 @@
   <w:style w:type="character" w:default="1" w:styleId="DefaultParagraphFont">
     <w:name w:val="Default Paragraph Font"/>
     <w:uiPriority w:val="1"/>
+    <w:semiHidden/>
     <w:unhideWhenUsed/>
   </w:style>
   <w:style w:type="table" w:default="1" w:styleId="TableNormal">
@@ -6285,6 +7814,62 @@
       </w:tblBorders>
     </w:tblPr>
   </w:style>
+  <w:style w:type="paragraph" w:styleId="TOCHeading">
+    <w:name w:val="TOC Heading"/>
+    <w:basedOn w:val="Heading1"/>
+    <w:next w:val="Normal"/>
+    <w:uiPriority w:val="39"/>
+    <w:unhideWhenUsed/>
+    <w:qFormat/>
+    <w:rsid w:val="007F396E"/>
+    <w:pPr>
+      <w:spacing w:before="240" w:after="0"/>
+      <w:outlineLvl w:val="9"/>
+    </w:pPr>
+    <w:rPr>
+      <w:color w:val="0F4761" w:themeColor="accent1" w:themeShade="BF"/>
+      <w:kern w:val="0"/>
+      <w:szCs w:val="32"/>
+      <w:lang w:val="en-US"/>
+      <w14:ligatures w14:val="none"/>
+    </w:rPr>
+  </w:style>
+  <w:style w:type="paragraph" w:styleId="TOC1">
+    <w:name w:val="toc 1"/>
+    <w:basedOn w:val="Normal"/>
+    <w:next w:val="Normal"/>
+    <w:autoRedefine/>
+    <w:uiPriority w:val="39"/>
+    <w:unhideWhenUsed/>
+    <w:rsid w:val="007F396E"/>
+    <w:pPr>
+      <w:spacing w:after="100"/>
+    </w:pPr>
+  </w:style>
+  <w:style w:type="paragraph" w:styleId="TOC2">
+    <w:name w:val="toc 2"/>
+    <w:basedOn w:val="Normal"/>
+    <w:next w:val="Normal"/>
+    <w:autoRedefine/>
+    <w:uiPriority w:val="39"/>
+    <w:unhideWhenUsed/>
+    <w:rsid w:val="007F396E"/>
+    <w:pPr>
+      <w:spacing w:after="100"/>
+      <w:ind w:left="220"/>
+    </w:pPr>
+  </w:style>
+  <w:style w:type="character" w:styleId="Hyperlink">
+    <w:name w:val="Hyperlink"/>
+    <w:basedOn w:val="DefaultParagraphFont"/>
+    <w:uiPriority w:val="99"/>
+    <w:unhideWhenUsed/>
+    <w:rsid w:val="007F396E"/>
+    <w:rPr>
+      <w:color w:val="467886" w:themeColor="hyperlink"/>
+      <w:u w:val="single"/>
+    </w:rPr>
+  </w:style>
 </w:styles>
 </file>
 
@@ -6583,6 +8168,18 @@
 </a:theme>
 </file>
 
+<file path=customXml/item1.xml><?xml version="1.0" encoding="utf-8"?>
+<b:Sources xmlns:b="http://schemas.openxmlformats.org/officeDocument/2006/bibliography" xmlns="http://schemas.openxmlformats.org/officeDocument/2006/bibliography" SelectedStyle="\APASixthEditionOfficeOnline.xsl" StyleName="APA" Version="6"/>
+</file>
+
+<file path=customXml/itemProps1.xml><?xml version="1.0" encoding="utf-8"?>
+<ds:datastoreItem xmlns:ds="http://schemas.openxmlformats.org/officeDocument/2006/customXml" ds:itemID="{1C8E8D2C-006A-43AD-8C64-31837FF7EB52}">
+  <ds:schemaRefs>
+    <ds:schemaRef ds:uri="http://schemas.openxmlformats.org/officeDocument/2006/bibliography"/>
+  </ds:schemaRefs>
+</ds:datastoreItem>
+</file>
+
 <file path=docMetadata/LabelInfo.xml><?xml version="1.0" encoding="utf-8"?>
 <clbl:labelList xmlns:clbl="http://schemas.microsoft.com/office/2020/mipLabelMetadata">
   <clbl:label id="{2f70ad68-4eca-4ffe-ad9d-60bfae449e23}" enabled="1" method="Standard" siteId="{b20a8f4d-0d6a-4f2e-83a2-181c968f8882}" contentBits="0" removed="0"/>

</xml_diff>